<commit_message>
Clarify frontier model article title and conclusions
</commit_message>
<xml_diff>
--- a/bmstu-semantic-relations/Article_BMSTU_practical.docx
+++ b/bmstu-semantic-relations/Article_BMSTU_practical.docx
@@ -24,7 +24,7 @@
         <w:rPr>
           <w:b/>
         </w:rPr>
-        <w:t>Сохранение смысловых отношений в ответах современных языковых моделей</w:t>
+        <w:t>Проверка смысловой точности ответов передовых языковых моделей</w:t>
       </w:r>
     </w:p>
     <w:p>
@@ -100,7 +100,7 @@
         <w:rPr>
           <w:b/>
         </w:rPr>
-        <w:t>Preserving Semantic Relations in Contemporary Language Model Responses</w:t>
+        <w:t>Checking Semantic Accuracy in Frontier Language Model Responses</w:t>
       </w:r>
     </w:p>
     <w:p>
@@ -432,19 +432,6 @@
         <w:rPr>
           <w:b w:val="0"/>
         </w:rPr>
-        <w:t>Общее в выбранных материалах — необходимость сохранить связь между выражением и его опорой. В L2 нужно не превращать возможного владельца бюджета в установленного; в примере Astra сохранить число; в ответе Argon — свойство объекта; в ответе Wonder — субъект вопроса. Это разные явления, и они не доказывают существования одной причины ошибок или их одинаковой частоты у всех моделей.</w:t>
-      </w:r>
-    </w:p>
-    <w:p>
-      <w:pPr>
-        <w:keepNext w:val="0"/>
-        <w:ind w:firstLine="709"/>
-        <w:jc w:val="both"/>
-      </w:pPr>
-      <w:r>
-        <w:rPr>
-          <w:b w:val="0"/>
-        </w:rPr>
         <w:t>Предлагается процедура экспертной проверки: сначала записать из входа участников и запрошенное отношение; затем найти соответствующие выражения в ответе и проверить количество, отрицание, время и степень уверенности; наконец, отметить добавления без опоры и отсутствие ответа. В случае L2 допустимые прочтения следует сохранить как альтернативы, а не выбирать по одному эталону. Для вопроса Xbox критерий требует указания времени отклика, а не только упоминания устройства. При закрытом видео проверка ограничена опубликованной интерпретацией вопроса.</w:t>
       </w:r>
     </w:p>
@@ -468,10 +455,7 @@
         <w:jc w:val="both"/>
       </w:pPr>
       <w:r>
-        <w:rPr>
-          <w:b w:val="0"/>
-        </w:rPr>
-        <w:t>Программа и четыре примера приложены к статье отдельными файлами. Эксперт самостоятельно задаёт варианты и сопоставляет эквивалентные формулировки: программа не извлекает смысл из текста и не устанавливает истинность. Предлагаемое продолжение исследования — разметить независимыми экспертами набор исходных заданий и ответов четырёх моделей, измерить согласие и затем проверить, улучшает ли автоматическое извлечение отношений обнаружение ошибок по сравнению с тематическим совпадением.</w:t>
+        <w:t>Программа и примеры приложены к статье. Разметку выполняет эксперт: программа не извлекает смысл из текста и не устанавливает истинность. Для дальнейшей проверки необходима независимая разметка ответов и сравнение автоматического извлечения отношений с проверкой совпадения темы.</w:t>
       </w:r>
     </w:p>
     <w:p>
@@ -506,10 +490,10 @@
         <w:jc w:val="both"/>
       </w:pPr>
       <w:r>
-        <w:rPr>
-          <w:b w:val="0"/>
-        </w:rPr>
-        <w:t>На примерах четырёх моделей показано, почему плавность речи, сохранение темы и правильная локальная связка недостаточны для проверки ответа: может измениться участник, запрошенный признак или степень определённости. Положительный пример Astra показывает и возможность сохранения смыслового числа при грамматической правке. Схема проверки пригодна как основа заданий для экспертной оценки передовых моделей; её результативность и распространённость выявленных расхождений требуют отдельного исследования на размеченных выборках и с участием нескольких независимых экспертов.</w:t>
+        <w:t>Общий вывод исследования состоит в том, что оценка передовых языковых моделей должна учитывать сохранение смысловых отношений между исходным сообщением и ответом. В рассмотренных случаях недостаточно совпадения темы или связности текста: ответ Argon об Xbox сохранил тему, но заменил время отклика частотой кадров; ответ Wonder о сновидениях сменил субъект с людей на модель. В то же время Astra сохранила двойственное число при правке, а в задании Fable существенным оказалось различие между возможной и установленной референцией. Эти случаи показывают применимость единого вопроса «что именно и с чем связано?» к разным языкам и задачам, но не доказывают общую частоту ошибок или единый механизм работы моделей.</w:t>
+      </w:r>
+      <w:r>
+        <w:t xml:space="preserve"> Для дальнейших исследований предлагается оценивать сохранность участников, их признаков и исходной неопределённости наряду с языковой связностью. Созданный прототип демонстрирует такую проверку на ручной разметке; чтобы установить её научную и практическую эффективность, необходимы независимая разметка, измерение согласия экспертов и сравнение с существующими методами на расширенной выборке.</w:t>
       </w:r>
     </w:p>
     <w:p>

</xml_diff>

<commit_message>
Strengthen conclusions on semantic accuracy
</commit_message>
<xml_diff>
--- a/bmstu-semantic-relations/Article_BMSTU_practical.docx
+++ b/bmstu-semantic-relations/Article_BMSTU_practical.docx
@@ -490,10 +490,7 @@
         <w:jc w:val="both"/>
       </w:pPr>
       <w:r>
-        <w:t>Общий вывод исследования состоит в том, что оценка передовых языковых моделей должна учитывать сохранение смысловых отношений между исходным сообщением и ответом. В рассмотренных случаях недостаточно совпадения темы или связности текста: ответ Argon об Xbox сохранил тему, но заменил время отклика частотой кадров; ответ Wonder о сновидениях сменил субъект с людей на модель. В то же время Astra сохранила двойственное число при правке, а в задании Fable существенным оказалось различие между возможной и установленной референцией. Эти случаи показывают применимость единого вопроса «что именно и с чем связано?» к разным языкам и задачам, но не доказывают общую частоту ошибок или единый механизм работы моделей.</w:t>
-      </w:r>
-      <w:r>
-        <w:t xml:space="preserve"> Для дальнейших исследований предлагается оценивать сохранность участников, их признаков и исходной неопределённости наряду с языковой связностью. Созданный прототип демонстрирует такую проверку на ручной разметке; чтобы установить её научную и практическую эффективность, необходимы независимая разметка, измерение согласия экспертов и сравнение с существующими методами на расширенной выборке.</w:t>
+        <w:t>Исследование выявило на рассмотренных материалах разрыв между внешней связностью ответа передовой языковой модели и сохранением смысла исходного сообщения. Совпадение темы не гарантирует сохранения запрошенного свойства: Argon перешла от времени отклика контроллера к частоте кадров. Связный вывод также может относиться к другому субъекту: Wonder говорила о собственном сне вместо человеческих сновидений. Пример Astra показывает, что смысловое число может сохраняться при грамматической правке, а задание Fable раскрывает самостоятельную роль неоднозначности: возможную референцию нельзя считать установленной. Следовательно, смысловая точность в рассмотренных задачах определяется не отдельными словами или связками, а соответствием отношений между участниками, признаками и степенью определённости исходному сообщению. Прототип демонстрирует проверку этих отношений на ручной разметке. Вывод относится к изученным примерам и не устанавливает частоту ошибок или общую причину их возникновения у моделей.</w:t>
       </w:r>
     </w:p>
     <w:p>

</xml_diff>

<commit_message>
Clarify linguistic findings and conference formatting
</commit_message>
<xml_diff>
--- a/bmstu-semantic-relations/Article_BMSTU_practical.docx
+++ b/bmstu-semantic-relations/Article_BMSTU_practical.docx
@@ -24,7 +24,7 @@
         <w:rPr>
           <w:b/>
         </w:rPr>
-        <w:t>Проверка смысловой точности ответов передовых языковых моделей</w:t>
+        <w:t>Сохранение смысловых отношений в ответах передовых языковых моделей</w:t>
       </w:r>
     </w:p>
     <w:p>
@@ -34,10 +34,16 @@
         <w:jc w:val="center"/>
       </w:pPr>
       <w:r>
+        <w:t>Рылов</w:t>
+      </w:r>
+      <w:r>
         <w:rPr>
-          <w:b w:val="0"/>
+          <w:vertAlign w:val="superscript"/>
         </w:rPr>
-        <w:t>Рылов Никита Игоревич¹(*)  huntthemdown@mail.ru</w:t>
+        <w:t>1(*)</w:t>
+      </w:r>
+      <w:r>
+        <w:t xml:space="preserve"> Никита Игоревич  huntthemdown@mail.ru</w:t>
       </w:r>
     </w:p>
     <w:p>
@@ -100,7 +106,7 @@
         <w:rPr>
           <w:b/>
         </w:rPr>
-        <w:t>Checking Semantic Accuracy in Frontier Language Model Responses</w:t>
+        <w:t>Preservation of Semantic Relations in Frontier Language Model Responses</w:t>
       </w:r>
     </w:p>
     <w:p>
@@ -110,10 +116,16 @@
         <w:jc w:val="center"/>
       </w:pPr>
       <w:r>
+        <w:t>Rylov</w:t>
+      </w:r>
+      <w:r>
         <w:rPr>
-          <w:b w:val="0"/>
+          <w:vertAlign w:val="superscript"/>
         </w:rPr>
-        <w:t>Nikita Igorevich Rylov¹(*)  huntthemdown@mail.ru</w:t>
+        <w:t>1(*)</w:t>
+      </w:r>
+      <w:r>
+        <w:t xml:space="preserve"> Nikita Igorevich  huntthemdown@mail.ru</w:t>
       </w:r>
     </w:p>
     <w:p>
@@ -213,7 +225,7 @@
         <w:rPr>
           <w:b w:val="0"/>
         </w:rPr>
-        <w:t>Проведён вторичный качественный анализ опубликованных материалов, выбранных по доступности исходного задания и описания ответа либо оценки. Это не случайная выборка и не новый эксперимент с моделями. Для каждого случая фиксировались вход, ответ или отчёт оценщика, подлежащий сохранению элемент и отличие ответа от входа. Отдельно использованы опубликованные количественные данные; пересчёт полных корпусов авторами настоящей работы не проводился.</w:t>
+        <w:t>Проведён вторичный качественный анализ опубликованных материалов, выбранных по доступности исходного задания и описания ответа либо оценки. Это не случайная выборка и не новый эксперимент с моделями. Для каждого случая фиксировались вход, ответ или отчёт оценщика, подлежащий сохранению элемент и отличие ответа от входа. Отдельно использованы опубликованные количественные данные; пересчёт полных корпусов автором настоящей работы не проводился.</w:t>
       </w:r>
     </w:p>
     <w:p>
@@ -465,7 +477,7 @@
         <w:rPr>
           <w:b w:val="0"/>
         </w:rPr>
-        <w:t>Проверка смысловых ролей уже реализована в SRLScore [8], где сравниваются представления источника и резюме; SummaC [1] также оценивает согласованность с источником. Здесь эти идеи применяются в ручном разборе конкретных современных моделей и дополняются проверкой неоднозначного входа. Процедура не заменяет существующие методы и пока не проверена на межэкспертном согласии или пользе для пользователей. Частоты маркеров [2] полезны для поиска дискурсивных особенностей, но не доказывают авторство или смысловую ошибку. Материалы [3, 4, 6] опубликованы коммерческими исследователями; их критерии и возможности проверки различаются.</w:t>
+        <w:t>Проверка смысловых ролей уже реализована в SRLScore [8], где сравниваются представления источника и резюме; SummaC [1] также оценивает согласованность с источником. Здесь эти идеи применяются в ручном разборе конкретных передовых моделей и дополняются проверкой неоднозначного входа. Процедура не заменяет существующие методы и пока не проверена на межэкспертном согласии или пользе для пользователей. Частоты маркеров [2] полезны для поиска дискурсивных особенностей, но не доказывают авторство или смысловую ошибку. Материалы [3, 4, 6] опубликованы коммерческими исследователями; их критерии и возможности проверки различаются.</w:t>
       </w:r>
     </w:p>
     <w:p>
@@ -487,7 +499,7 @@
         <w:jc w:val="both"/>
       </w:pPr>
       <w:r>
-        <w:t>Исследование выявило на рассмотренных материалах разрыв между внешней связностью ответа передовой языковой модели и сохранением смысла исходного сообщения. Совпадение темы не гарантирует сохранения запрошенного свойства: Argon перешла от времени отклика контроллера к частоте кадров. Связный вывод также может относиться к другому субъекту: Wonder говорила о собственном сне вместо человеческих сновидений. Пример Astra показывает, что смысловое число может сохраняться при грамматической правке, а задание Fable раскрывает самостоятельную роль неоднозначности: возможную референцию нельзя считать установленной. Следовательно, смысловая точность в рассмотренных задачах определяется не отдельными словами или связками, а соответствием отношений между участниками, признаками и степенью определённости исходному сообщению. Лингвистическая общность материалов на разных языках проявляется в проверке одних и тех же смысловых отношений при разных средствах их выражения: в испанском примере неоднозначность связана с местоимением, в арабском число передаётся согласованием, в жестовом — отношение проверяется по интерпретации вопроса и текстовому ответу. Это общность аналитических признаков, а не доказательство одинаковых ошибок моделей. Прототип демонстрирует проверку этих отношений на ручной разметке. Вывод относится к изученным примерам и не устанавливает частоту ошибок или общую причину их возникновения у моделей.</w:t>
+        <w:t>Лингвистический результат исследования состоит в разграничении двух уровней организации ответа: языкового оформления высказывания и его соотнесённости с исходным контекстом. В рассмотренных примерах грамматическая связность и повтор темы не обеспечивают сохранения смысла: Argon связывает Xbox с частотой кадров вместо запрошенного времени отклика, а местоимение I в ответе Wonder меняет референт с людей на модель. В испанском задании Fable значение притяжательного su зависит от контекста и допускает несколько владельцев; арабская правка Astra сохраняет количество через согласование форм двойственного числа. Эти примеры показывают, что смысл формируется не отдельными словами, а их отношениями с участниками ситуации и контекстом. Общий для разнородных материалов объект анализа — сохранность референта, его признаков и степени определённости при разных языковых средствах. Созданный прототип воспроизводит сравнение этих признаков по ручной разметке. Наблюдения относятся к выбранным случаям и не устанавливают одинаковую частоту ошибок или общий внутренний механизм моделей.</w:t>
       </w:r>
     </w:p>
     <w:p>

</xml_diff>